<commit_message>
Digital Detox report: add Vietnam mobile connections from Digital 2026
Co-Authored-By: Claude Opus 5.5 <noreply@anthropic.com>
Claude-Session: https://claude.ai/code/session_01VCwthevj8qD51hsW5qzMkw
</commit_message>
<xml_diff>
--- a/reports/vietnam-digital-detox-2026/ABrighter_Digital_Detox_Vietnam_2026.docx
+++ b/reports/vietnam-digital-detox-2026/ABrighter_Digital_Detox_Vietnam_2026.docx
@@ -1722,7 +1722,20 @@
                 <w:sz w:val="19"/>
                 <w:szCs w:val="19"/>
               </w:rPr>
-              <w:t xml:space="preserve">Several forces explain why Vietnam sits above the world average. The first is that Vietnam moved straight to the smartphone: for many households the phone is the first and only computer, so work, study, shopping and payments all run through one device. The second is the role of messaging. Zalo, a Vietnamese platform with 78.3 million monthly users, often carries work groups, school announcements and family conversations, so stepping away from it means stepping away from daily obligations. The third is that payments now live on the phone as well, through QR codes that have spread from supermarkets to street stalls.</w:t>
+              <w:t xml:space="preserve">Several forces explain why Vietnam sits above the world average. The first is that Vietnam moved straight to the smartphone: for many households the phone is the first and only computer, so work, study, shopping and payments all run through one device. Vietnam counts 137 million mobile connections, equal to 134% of its population, which means many people carry more than one SIM or device.</w:t>
+            </w:r>
+            <w:r>
+              <w:rPr>
+                <w:rStyle w:val="FootnoteReference"/>
+              </w:rPr>
+              <w:footnoteReference w:id="6"/>
+            </w:r>
+            <w:r>
+              <w:rPr>
+                <w:sz w:val="19"/>
+                <w:szCs w:val="19"/>
+              </w:rPr>
+              <w:t xml:space="preserve"> The second is the role of messaging. Zalo, a Vietnamese platform with 78.3 million monthly users, often carries work groups, school announcements and family conversations, so stepping away from it means stepping away from daily obligations. The third is that payments now live on the phone as well, through QR codes that have spread from supermarkets to street stalls.</w:t>
             </w:r>
           </w:p>
           <w:p>
@@ -1788,7 +1801,7 @@
         <w:rPr>
           <w:rStyle w:val="FootnoteReference"/>
         </w:rPr>
-        <w:footnoteReference w:id="6"/>
+        <w:footnoteReference w:id="7"/>
       </w:r>
       <w:r>
         <w:rPr>
@@ -1801,7 +1814,7 @@
         <w:rPr>
           <w:rStyle w:val="FootnoteReference"/>
         </w:rPr>
-        <w:footnoteReference w:id="7"/>
+        <w:footnoteReference w:id="8"/>
       </w:r>
       <w:r>
         <w:rPr>
@@ -2169,7 +2182,7 @@
               <w:rPr>
                 <w:rStyle w:val="FootnoteReference"/>
               </w:rPr>
-              <w:footnoteReference w:id="8"/>
+              <w:footnoteReference w:id="9"/>
             </w:r>
             <w:r>
               <w:rPr>
@@ -2361,7 +2374,7 @@
               <w:rPr>
                 <w:rStyle w:val="FootnoteReference"/>
               </w:rPr>
-              <w:footnoteReference w:id="9"/>
+              <w:footnoteReference w:id="10"/>
             </w:r>
           </w:p>
           <w:p>
@@ -2603,7 +2616,7 @@
               <w:rPr>
                 <w:rStyle w:val="FootnoteReference"/>
               </w:rPr>
-              <w:footnoteReference w:id="10"/>
+              <w:footnoteReference w:id="11"/>
             </w:r>
           </w:p>
         </w:tc>
@@ -2781,7 +2794,7 @@
               <w:rPr>
                 <w:rStyle w:val="FootnoteReference"/>
               </w:rPr>
-              <w:footnoteReference w:id="11"/>
+              <w:footnoteReference w:id="12"/>
             </w:r>
           </w:p>
         </w:tc>
@@ -3381,7 +3394,7 @@
         <w:rPr>
           <w:rStyle w:val="FootnoteReference"/>
         </w:rPr>
-        <w:footnoteReference w:id="12"/>
+        <w:footnoteReference w:id="13"/>
       </w:r>
       <w:r>
         <w:rPr>
@@ -3415,7 +3428,7 @@
         <w:rPr>
           <w:rStyle w:val="FootnoteReference"/>
         </w:rPr>
-        <w:footnoteReference w:id="13"/>
+        <w:footnoteReference w:id="14"/>
       </w:r>
     </w:p>
     <w:p>
@@ -3442,7 +3455,7 @@
         <w:rPr>
           <w:rStyle w:val="FootnoteReference"/>
         </w:rPr>
-        <w:footnoteReference w:id="14"/>
+        <w:footnoteReference w:id="15"/>
       </w:r>
     </w:p>
     <w:p>
@@ -3469,7 +3482,7 @@
         <w:rPr>
           <w:rStyle w:val="FootnoteReference"/>
         </w:rPr>
-        <w:footnoteReference w:id="15"/>
+        <w:footnoteReference w:id="16"/>
       </w:r>
     </w:p>
     <w:p>
@@ -3496,7 +3509,7 @@
         <w:rPr>
           <w:rStyle w:val="FootnoteReference"/>
         </w:rPr>
-        <w:footnoteReference w:id="16"/>
+        <w:footnoteReference w:id="17"/>
       </w:r>
     </w:p>
     <w:p>
@@ -3514,7 +3527,7 @@
         <w:rPr>
           <w:rStyle w:val="FootnoteReference"/>
         </w:rPr>
-        <w:footnoteReference w:id="17"/>
+        <w:footnoteReference w:id="18"/>
       </w:r>
       <w:r>
         <w:rPr>
@@ -3527,7 +3540,7 @@
         <w:rPr>
           <w:rStyle w:val="FootnoteReference"/>
         </w:rPr>
-        <w:footnoteReference w:id="18"/>
+        <w:footnoteReference w:id="19"/>
       </w:r>
       <w:r>
         <w:rPr>
@@ -3689,7 +3702,7 @@
         <w:rPr>
           <w:rStyle w:val="FootnoteReference"/>
         </w:rPr>
-        <w:footnoteReference w:id="19"/>
+        <w:footnoteReference w:id="20"/>
       </w:r>
       <w:r>
         <w:rPr>
@@ -3723,7 +3736,7 @@
         <w:rPr>
           <w:rStyle w:val="FootnoteReference"/>
         </w:rPr>
-        <w:footnoteReference w:id="20"/>
+        <w:footnoteReference w:id="21"/>
       </w:r>
       <w:r>
         <w:rPr>
@@ -4115,7 +4128,7 @@
               <w:rPr>
                 <w:rStyle w:val="FootnoteReference"/>
               </w:rPr>
-              <w:footnoteReference w:id="21"/>
+              <w:footnoteReference w:id="22"/>
             </w:r>
           </w:p>
         </w:tc>
@@ -4233,7 +4246,7 @@
               <w:rPr>
                 <w:rStyle w:val="FootnoteReference"/>
               </w:rPr>
-              <w:footnoteReference w:id="22"/>
+              <w:footnoteReference w:id="23"/>
             </w:r>
           </w:p>
         </w:tc>
@@ -4351,7 +4364,7 @@
               <w:rPr>
                 <w:rStyle w:val="FootnoteReference"/>
               </w:rPr>
-              <w:footnoteReference w:id="23"/>
+              <w:footnoteReference w:id="24"/>
             </w:r>
           </w:p>
         </w:tc>
@@ -4553,7 +4566,7 @@
               <w:rPr>
                 <w:rStyle w:val="FootnoteReference"/>
               </w:rPr>
-              <w:footnoteReference w:id="24"/>
+              <w:footnoteReference w:id="25"/>
             </w:r>
             <w:r>
               <w:rPr>
@@ -4582,7 +4595,7 @@
               <w:rPr>
                 <w:rStyle w:val="FootnoteReference"/>
               </w:rPr>
-              <w:footnoteReference w:id="25"/>
+              <w:footnoteReference w:id="26"/>
             </w:r>
             <w:r>
               <w:rPr>
@@ -4595,7 +4608,7 @@
               <w:rPr>
                 <w:rStyle w:val="FootnoteReference"/>
               </w:rPr>
-              <w:footnoteReference w:id="26"/>
+              <w:footnoteReference w:id="27"/>
             </w:r>
           </w:p>
         </w:tc>
@@ -4621,7 +4634,7 @@
         <w:rPr>
           <w:rStyle w:val="FootnoteReference"/>
         </w:rPr>
-        <w:footnoteReference w:id="27"/>
+        <w:footnoteReference w:id="28"/>
       </w:r>
       <w:r>
         <w:rPr>
@@ -5808,7 +5821,7 @@
               <w:rPr>
                 <w:rStyle w:val="FootnoteReference"/>
               </w:rPr>
-              <w:footnoteReference w:id="28"/>
+              <w:footnoteReference w:id="29"/>
             </w:r>
             <w:r>
               <w:rPr>
@@ -6024,7 +6037,7 @@
         <w:rPr>
           <w:rStyle w:val="FootnoteReference"/>
         </w:rPr>
-        <w:footnoteReference w:id="29"/>
+        <w:footnoteReference w:id="30"/>
       </w:r>
       <w:r>
         <w:rPr>
@@ -6037,7 +6050,7 @@
         <w:rPr>
           <w:rStyle w:val="FootnoteReference"/>
         </w:rPr>
-        <w:footnoteReference w:id="30"/>
+        <w:footnoteReference w:id="31"/>
       </w:r>
       <w:r>
         <w:rPr>
@@ -6050,7 +6063,7 @@
         <w:rPr>
           <w:rStyle w:val="FootnoteReference"/>
         </w:rPr>
-        <w:footnoteReference w:id="31"/>
+        <w:footnoteReference w:id="32"/>
       </w:r>
       <w:r>
         <w:rPr>
@@ -6212,7 +6225,7 @@
         <w:rPr>
           <w:rStyle w:val="FootnoteReference"/>
         </w:rPr>
-        <w:footnoteReference w:id="32"/>
+        <w:footnoteReference w:id="33"/>
       </w:r>
       <w:r>
         <w:rPr>
@@ -6225,7 +6238,7 @@
         <w:rPr>
           <w:rStyle w:val="FootnoteReference"/>
         </w:rPr>
-        <w:footnoteReference w:id="33"/>
+        <w:footnoteReference w:id="34"/>
       </w:r>
       <w:r>
         <w:rPr>
@@ -6275,7 +6288,7 @@
         <w:rPr>
           <w:rStyle w:val="FootnoteReference"/>
         </w:rPr>
-        <w:footnoteReference w:id="34"/>
+        <w:footnoteReference w:id="35"/>
       </w:r>
       <w:r>
         <w:rPr>
@@ -6570,7 +6583,7 @@
         <w:rPr>
           <w:rStyle w:val="FootnoteReference"/>
         </w:rPr>
-        <w:footnoteReference w:id="35"/>
+        <w:footnoteReference w:id="36"/>
       </w:r>
       <w:r>
         <w:rPr>
@@ -6615,7 +6628,7 @@
         <w:rPr>
           <w:rStyle w:val="FootnoteReference"/>
         </w:rPr>
-        <w:footnoteReference w:id="36"/>
+        <w:footnoteReference w:id="37"/>
       </w:r>
       <w:r>
         <w:rPr>
@@ -6776,7 +6789,7 @@
               <w:rPr>
                 <w:rStyle w:val="FootnoteReference"/>
               </w:rPr>
-              <w:footnoteReference w:id="37"/>
+              <w:footnoteReference w:id="38"/>
             </w:r>
             <w:r>
               <w:rPr>
@@ -8584,7 +8597,7 @@
         <w:rPr>
           <w:rStyle w:val="FootnoteReference"/>
         </w:rPr>
-        <w:footnoteReference w:id="38"/>
+        <w:footnoteReference w:id="39"/>
       </w:r>
     </w:p>
     <w:p>
@@ -10342,7 +10355,7 @@
           <w:sz w:val="14"/>
           <w:szCs w:val="14"/>
         </w:rPr>
-        <w:t xml:space="preserve">UnplugWell (2025), Key Findings From the 2025 Global Digital Detox Survey: 15,000 respondents in 24 countries.</w:t>
+        <w:t xml:space="preserve">DataReportal, Digital 2026: Vietnam, as reported by Elite Asia (2026): 137 million cellular mobile connections, equal to 134% of the population.</w:t>
       </w:r>
     </w:p>
   </w:footnote>
@@ -10364,7 +10377,7 @@
           <w:sz w:val="14"/>
           <w:szCs w:val="14"/>
         </w:rPr>
-        <w:t xml:space="preserve">Decision Lab, Connected Consumer surveys (2025), as reported by VietNamNet and Bao Ha Tinh: 74% of Gen Z use four or more social apps a day; 75% wish to leave at least one platform.</w:t>
+        <w:t xml:space="preserve">UnplugWell (2025), Key Findings From the 2025 Global Digital Detox Survey: 15,000 respondents in 24 countries.</w:t>
       </w:r>
     </w:p>
   </w:footnote>
@@ -10386,7 +10399,7 @@
           <w:sz w:val="14"/>
           <w:szCs w:val="14"/>
         </w:rPr>
-        <w:t xml:space="preserve">Ta-sinuzzaman, M. (2025), Reinforcement Schedule in the Digital Age; Sharma, Y. and Pothen, S. (2025), Social Media and the Dopamine System.</w:t>
+        <w:t xml:space="preserve">Decision Lab, Connected Consumer surveys (2025), as reported by VietNamNet and Bao Ha Tinh: 74% of Gen Z use four or more social apps a day; 75% wish to leave at least one platform.</w:t>
       </w:r>
     </w:p>
   </w:footnote>
@@ -10408,7 +10421,7 @@
           <w:sz w:val="14"/>
           <w:szCs w:val="14"/>
         </w:rPr>
-        <w:t xml:space="preserve">SalamGuard (2023), The Dopamine Loop.</w:t>
+        <w:t xml:space="preserve">Ta-sinuzzaman, M. (2025), Reinforcement Schedule in the Digital Age; Sharma, Y. and Pothen, S. (2025), Social Media and the Dopamine System.</w:t>
       </w:r>
     </w:p>
   </w:footnote>
@@ -10430,7 +10443,7 @@
           <w:sz w:val="14"/>
           <w:szCs w:val="14"/>
         </w:rPr>
-        <w:t xml:space="preserve">Pires, C. (2026), How Social Apps' Infinite Scroll Design Is Rewiring User Behavior, Visualmodo.</w:t>
+        <w:t xml:space="preserve">SalamGuard (2023), The Dopamine Loop.</w:t>
       </w:r>
     </w:p>
   </w:footnote>
@@ -10452,7 +10465,7 @@
           <w:sz w:val="14"/>
           <w:szCs w:val="14"/>
         </w:rPr>
-        <w:t xml:space="preserve">Saif, S. (2025), Red notification dot: the psychological manipulation to keep users engaged.</w:t>
+        <w:t xml:space="preserve">Pires, C. (2026), How Social Apps' Infinite Scroll Design Is Rewiring User Behavior, Visualmodo.</w:t>
       </w:r>
     </w:p>
   </w:footnote>
@@ -10474,7 +10487,7 @@
           <w:sz w:val="14"/>
           <w:szCs w:val="14"/>
         </w:rPr>
-        <w:t xml:space="preserve">Huang, J. and Ge, Z. et al. (2025), Associations Between Social Media Use and Anxiety and Depression Among Older Adults, JMIR Aging.</w:t>
+        <w:t xml:space="preserve">Saif, S. (2025), Red notification dot: the psychological manipulation to keep users engaged.</w:t>
       </w:r>
     </w:p>
   </w:footnote>
@@ -10496,7 +10509,7 @@
           <w:sz w:val="14"/>
           <w:szCs w:val="14"/>
         </w:rPr>
-        <w:t xml:space="preserve">Hjetland, G. et al. (2025), How and when screens are used: comparing different screen activities and sleep in Norwegian university students, Frontiers in Psychiatry.</w:t>
+        <w:t xml:space="preserve">Huang, J. and Ge, Z. et al. (2025), Associations Between Social Media Use and Anxiety and Depression Among Older Adults, JMIR Aging.</w:t>
       </w:r>
     </w:p>
   </w:footnote>
@@ -10518,7 +10531,7 @@
           <w:sz w:val="14"/>
           <w:szCs w:val="14"/>
         </w:rPr>
-        <w:t xml:space="preserve">Pucker, A. et al. (2024), Digital Eye Strain: Updated Perspectives, Taylor and Francis.</w:t>
+        <w:t xml:space="preserve">Hjetland, G. et al. (2025), How and when screens are used: comparing different screen activities and sleep in Norwegian university students, Frontiers in Psychiatry.</w:t>
       </w:r>
     </w:p>
   </w:footnote>
@@ -10540,7 +10553,7 @@
           <w:sz w:val="14"/>
           <w:szCs w:val="14"/>
         </w:rPr>
-        <w:t xml:space="preserve">Poles, A. (2025), Impact of Social Media Usage on Attention Spans, Scientific Research.</w:t>
+        <w:t xml:space="preserve">Pucker, A. et al. (2024), Digital Eye Strain: Updated Perspectives, Taylor and Francis.</w:t>
       </w:r>
     </w:p>
   </w:footnote>
@@ -10562,7 +10575,7 @@
           <w:sz w:val="14"/>
           <w:szCs w:val="14"/>
         </w:rPr>
-        <w:t xml:space="preserve">Abeele, M. (2024), Co-present mobile phone use as an expectancy violation, Taylor and Francis.</w:t>
+        <w:t xml:space="preserve">Poles, A. (2025), Impact of Social Media Usage on Attention Spans, Scientific Research.</w:t>
       </w:r>
     </w:p>
   </w:footnote>
@@ -10584,7 +10597,7 @@
           <w:sz w:val="14"/>
           <w:szCs w:val="14"/>
         </w:rPr>
-        <w:t xml:space="preserve">Systematic review of 11 Vietnamese studies (12,931 participants) on digital addiction and mental health, Tap chi Y hoc Cong dong and PubMed Central (2025).</w:t>
+        <w:t xml:space="preserve">Abeele, M. (2024), Co-present mobile phone use as an expectancy violation, Taylor and Francis.</w:t>
       </w:r>
     </w:p>
   </w:footnote>
@@ -10606,7 +10619,7 @@
           <w:sz w:val="14"/>
           <w:szCs w:val="14"/>
         </w:rPr>
-        <w:t xml:space="preserve">Study reported by Bao Ha Tinh (2026): 90.7% of surveyed young Vietnamese reported physical symptoms linked to intensive digital use.</w:t>
+        <w:t xml:space="preserve">Systematic review of 11 Vietnamese studies (12,931 participants) on digital addiction and mental health, Tap chi Y hoc Cong dong and PubMed Central (2025).</w:t>
       </w:r>
     </w:p>
   </w:footnote>
@@ -10628,7 +10641,7 @@
           <w:sz w:val="14"/>
           <w:szCs w:val="14"/>
         </w:rPr>
-        <w:t xml:space="preserve">Bhalla, P. (2025), Digital Detox Statistics and Facts, ElectroIQ.</w:t>
+        <w:t xml:space="preserve">Study reported by Bao Ha Tinh (2026): 90.7% of surveyed young Vietnamese reported physical symptoms linked to intensive digital use.</w:t>
       </w:r>
     </w:p>
   </w:footnote>
@@ -10650,7 +10663,7 @@
           <w:sz w:val="14"/>
           <w:szCs w:val="14"/>
         </w:rPr>
-        <w:t xml:space="preserve">Davis, C. G. and Goldfield, G. S. (2025), Limiting social media use decreases depression, anxiety and fear of missing out in youth with emotional distress, American Psychological Association.</w:t>
+        <w:t xml:space="preserve">Bhalla, P. (2025), Digital Detox Statistics and Facts, ElectroIQ.</w:t>
       </w:r>
     </w:p>
   </w:footnote>
@@ -10672,7 +10685,7 @@
           <w:sz w:val="14"/>
           <w:szCs w:val="14"/>
         </w:rPr>
-        <w:t xml:space="preserve">Fox, E. (2025), Scrolling instead of working? YouTuber Hank Green's new app wants to help, NBC News.</w:t>
+        <w:t xml:space="preserve">Davis, C. G. and Goldfield, G. S. (2025), Limiting social media use decreases depression, anxiety and fear of missing out in youth with emotional distress, American Psychological Association.</w:t>
       </w:r>
     </w:p>
   </w:footnote>
@@ -10694,7 +10707,7 @@
           <w:sz w:val="14"/>
           <w:szCs w:val="14"/>
         </w:rPr>
-        <w:t xml:space="preserve">Design Middle East (2025), IKEA UAE Launches 'Phone Sleep' Collection.</w:t>
+        <w:t xml:space="preserve">Fox, E. (2025), Scrolling instead of working? YouTuber Hank Green's new app wants to help, NBC News.</w:t>
       </w:r>
     </w:p>
   </w:footnote>
@@ -10716,7 +10729,7 @@
           <w:sz w:val="14"/>
           <w:szCs w:val="14"/>
         </w:rPr>
-        <w:t xml:space="preserve">Herring, J. (2026), KitKat creates a wrapper that blocks phone signals, Famous Campaigns.</w:t>
+        <w:t xml:space="preserve">Design Middle East (2025), IKEA UAE Launches 'Phone Sleep' Collection.</w:t>
       </w:r>
     </w:p>
   </w:footnote>
@@ -10738,7 +10751,7 @@
           <w:sz w:val="14"/>
           <w:szCs w:val="14"/>
         </w:rPr>
-        <w:t xml:space="preserve">Circular 32/2020/TT-BGDDT of the Ministry of Education and Training on general education school charters.</w:t>
+        <w:t xml:space="preserve">Herring, J. (2026), KitKat creates a wrapper that blocks phone signals, Famous Campaigns.</w:t>
       </w:r>
     </w:p>
   </w:footnote>
@@ -10760,7 +10773,7 @@
           <w:sz w:val="14"/>
           <w:szCs w:val="14"/>
         </w:rPr>
-        <w:t xml:space="preserve">VnEconomy and Vietnam.vn (2025-2026): Ho Chi Minh City piloted restrictions at 16 schools from October 2025 and extended them to more than 500 schools from January 2026.</w:t>
+        <w:t xml:space="preserve">Circular 32/2020/TT-BGDDT of the Ministry of Education and Training on general education school charters.</w:t>
       </w:r>
     </w:p>
   </w:footnote>
@@ -10782,7 +10795,7 @@
           <w:sz w:val="14"/>
           <w:szCs w:val="14"/>
         </w:rPr>
-        <w:t xml:space="preserve">Decree 147/2024/ND-CP on the management, provision and use of internet services and online information, effective 25 December 2024; DFDL (2024).</w:t>
+        <w:t xml:space="preserve">VnEconomy and Vietnam.vn (2025-2026): Ho Chi Minh City piloted restrictions at 16 schools from October 2025 and extended them to more than 500 schools from January 2026.</w:t>
       </w:r>
     </w:p>
   </w:footnote>
@@ -10804,7 +10817,7 @@
           <w:sz w:val="14"/>
           <w:szCs w:val="14"/>
         </w:rPr>
-        <w:t xml:space="preserve">Tuoi Tre News (24 July 2026), Bloomberg (24 July 2026) and TNGlobal (4 September 2026) on the draft decree of the Ministry of Culture, Sports and Tourism.</w:t>
+        <w:t xml:space="preserve">Decree 147/2024/ND-CP on the management, provision and use of internet services and online information, effective 25 December 2024; DFDL (2024).</w:t>
       </w:r>
     </w:p>
   </w:footnote>
@@ -10826,7 +10839,7 @@
           <w:sz w:val="14"/>
           <w:szCs w:val="14"/>
         </w:rPr>
-        <w:t xml:space="preserve">University of Newcastle (Australia) study of June 2026 on access to social media by children under 16.</w:t>
+        <w:t xml:space="preserve">Tuoi Tre News (24 July 2026), Bloomberg (24 July 2026) and TNGlobal (4 September 2026) on the draft decree of the Ministry of Culture, Sports and Tourism.</w:t>
       </w:r>
     </w:p>
   </w:footnote>
@@ -10848,7 +10861,7 @@
           <w:sz w:val="14"/>
           <w:szCs w:val="14"/>
         </w:rPr>
-        <w:t xml:space="preserve">State Bank of Vietnam as reported by The Investor (2026): nearly 87% of adults hold a bank account; draft National Financial Inclusion Strategy 2026-2030 targets 95% of those aged 15 and above.</w:t>
+        <w:t xml:space="preserve">University of Newcastle (Australia) study of June 2026 on access to social media by children under 16.</w:t>
       </w:r>
     </w:p>
   </w:footnote>
@@ -10870,7 +10883,7 @@
           <w:sz w:val="14"/>
           <w:szCs w:val="14"/>
         </w:rPr>
-        <w:t xml:space="preserve">State Bank of Vietnam as reported by Thoi bao Tai chinh Viet Nam (2026): cashless payments equal to about 28 times GDP in 2025; volume up more than 42% and value up nearly 23%.</w:t>
+        <w:t xml:space="preserve">State Bank of Vietnam as reported by The Investor (2026): nearly 87% of adults hold a bank account; draft National Financial Inclusion Strategy 2026-2030 targets 95% of those aged 15 and above.</w:t>
       </w:r>
     </w:p>
   </w:footnote>
@@ -10892,7 +10905,7 @@
           <w:sz w:val="14"/>
           <w:szCs w:val="14"/>
         </w:rPr>
-        <w:t xml:space="preserve">State Bank of Vietnam data for the first nine months of 2025: QR code payments up 150.67% in value; internet transactions up 51.2% in volume.</w:t>
+        <w:t xml:space="preserve">State Bank of Vietnam as reported by Thoi bao Tai chinh Viet Nam (2026): cashless payments equal to about 28 times GDP in 2025; volume up more than 42% and value up nearly 23%.</w:t>
       </w:r>
     </w:p>
   </w:footnote>
@@ -10914,7 +10927,7 @@
           <w:sz w:val="14"/>
           <w:szCs w:val="14"/>
         </w:rPr>
-        <w:t xml:space="preserve">Tuoi Tre News (October 2025): online fraud losses near VND 20 trillion in 2024. Ministry of Public Security: online fraud losses above VND 8 trillion in 2025.</w:t>
+        <w:t xml:space="preserve">State Bank of Vietnam data for the first nine months of 2025: QR code payments up 150.67% in value; internet transactions up 51.2% in volume.</w:t>
       </w:r>
     </w:p>
   </w:footnote>
@@ -10936,7 +10949,7 @@
           <w:sz w:val="14"/>
           <w:szCs w:val="14"/>
         </w:rPr>
-        <w:t xml:space="preserve">Decision 2345/QD-NHNN of the State Bank of Vietnam: biometric authentication for transfers above VND 10 million or above VND 20 million a day, from 1 July 2024.</w:t>
+        <w:t xml:space="preserve">Tuoi Tre News (October 2025): online fraud losses near VND 20 trillion in 2024. Ministry of Public Security: online fraud losses above VND 8 trillion in 2025.</w:t>
       </w:r>
     </w:p>
   </w:footnote>
@@ -10958,7 +10971,7 @@
           <w:sz w:val="14"/>
           <w:szCs w:val="14"/>
         </w:rPr>
-        <w:t xml:space="preserve">O'Connor, M. (2025), New Data: Excessive Screen Time Sparks a Digital Detox Movement, NuVoodoo.</w:t>
+        <w:t xml:space="preserve">Decision 2345/QD-NHNN of the State Bank of Vietnam: biometric authentication for transfers above VND 10 million or above VND 20 million a day, from 1 July 2024.</w:t>
       </w:r>
     </w:p>
   </w:footnote>
@@ -10980,7 +10993,7 @@
           <w:sz w:val="14"/>
           <w:szCs w:val="14"/>
         </w:rPr>
-        <w:t xml:space="preserve">Monzo (2026), Managing your app notifications; Changing your marketing preferences.</w:t>
+        <w:t xml:space="preserve">O'Connor, M. (2025), New Data: Excessive Screen Time Sparks a Digital Detox Movement, NuVoodoo.</w:t>
       </w:r>
     </w:p>
   </w:footnote>
@@ -11002,7 +11015,7 @@
           <w:sz w:val="14"/>
           <w:szCs w:val="14"/>
         </w:rPr>
-        <w:t xml:space="preserve">UOB (2025), TMRW Smart Insights.</w:t>
+        <w:t xml:space="preserve">Monzo (2026), Managing your app notifications; Changing your marketing preferences.</w:t>
       </w:r>
     </w:p>
   </w:footnote>
@@ -11024,11 +11037,33 @@
           <w:sz w:val="14"/>
           <w:szCs w:val="14"/>
         </w:rPr>
-        <w:t xml:space="preserve">Vnbusiness (2025) on MyVIB and the ViePro virtual assistant; Thi truong Tai chinh Tien te (2026) on LPBank Plus.</w:t>
+        <w:t xml:space="preserve">UOB (2025), TMRW Smart Insights.</w:t>
       </w:r>
     </w:p>
   </w:footnote>
   <w:footnote w:id="38">
+    <w:p>
+      <w:pPr>
+        <w:spacing w:after="0"/>
+      </w:pPr>
+      <w:r>
+        <w:rPr>
+          <w:rStyle w:val="FootnoteReference"/>
+        </w:rPr>
+        <w:footnoteRef/>
+      </w:r>
+      <w:r>
+        <w:rPr>
+          <w:rFonts w:ascii="Arial" w:cs="Arial" w:eastAsia="Arial" w:hAnsi="Arial"/>
+          <w:color w:val="6B7785"/>
+          <w:sz w:val="14"/>
+          <w:szCs w:val="14"/>
+        </w:rPr>
+        <w:t xml:space="preserve">Vnbusiness (2025) on MyVIB and the ViePro virtual assistant; Thi truong Tai chinh Tien te (2026) on LPBank Plus.</w:t>
+      </w:r>
+    </w:p>
+  </w:footnote>
+  <w:footnote w:id="39">
     <w:p>
       <w:pPr>
         <w:spacing w:after="0"/>

</xml_diff>

<commit_message>
Give both reports original titles and chapter headings
Main titles, chapter titles and box titles rewritten so they no longer
mirror the source studies; content unchanged.

Co-Authored-By: Claude Opus 5.5 <noreply@anthropic.com>
Claude-Session: https://claude.ai/code/session_01VCwthevj8qD51hsW5qzMkw
</commit_message>
<xml_diff>
--- a/reports/vietnam-digital-detox-2026/ABrighter_Digital_Detox_Vietnam_2026.docx
+++ b/reports/vietnam-digital-detox-2026/ABrighter_Digital_Detox_Vietnam_2026.docx
@@ -166,7 +166,7 @@
           <w:sz w:val="22"/>
           <w:szCs w:val="22"/>
         </w:rPr>
-        <w:t xml:space="preserve">Introduction</w:t>
+        <w:t xml:space="preserve">A Nation Always Online</w:t>
       </w:r>
       <w:r>
         <w:rPr>
@@ -207,7 +207,7 @@
           <w:sz w:val="22"/>
           <w:szCs w:val="22"/>
         </w:rPr>
-        <w:t xml:space="preserve">How Social Media Platforms Are Designed to Maximise Engagement</w:t>
+        <w:t xml:space="preserve">Engineered to Hold Attention</w:t>
       </w:r>
       <w:r>
         <w:rPr>
@@ -248,7 +248,7 @@
           <w:sz w:val="22"/>
           <w:szCs w:val="22"/>
         </w:rPr>
-        <w:t xml:space="preserve">What Is Digital Detox and Why Does It Matter?</w:t>
+        <w:t xml:space="preserve">The Case for Switching Off</w:t>
       </w:r>
       <w:r>
         <w:rPr>
@@ -289,7 +289,7 @@
           <w:sz w:val="22"/>
           <w:szCs w:val="22"/>
         </w:rPr>
-        <w:t xml:space="preserve">Advancing Digital Detox: From Social Awareness to Public Policy</w:t>
+        <w:t xml:space="preserve">From Personal Choice to Public Rules</w:t>
       </w:r>
       <w:r>
         <w:rPr>
@@ -330,7 +330,7 @@
           <w:sz w:val="22"/>
           <w:szCs w:val="22"/>
         </w:rPr>
-        <w:t xml:space="preserve">The Implications of Digital Detox for Digital Banking in Vietnam</w:t>
+        <w:t xml:space="preserve">Banking in a Detox Era</w:t>
       </w:r>
       <w:r>
         <w:rPr>
@@ -371,7 +371,7 @@
           <w:sz w:val="22"/>
           <w:szCs w:val="22"/>
         </w:rPr>
-        <w:t xml:space="preserve">ABrighter Research View</w:t>
+        <w:t xml:space="preserve">The ABrighter Perspective</w:t>
       </w:r>
       <w:r>
         <w:rPr>
@@ -1294,7 +1294,7 @@
           <w:sz w:val="44"/>
           <w:szCs w:val="44"/>
         </w:rPr>
-        <w:t xml:space="preserve">Introduction</w:t>
+        <w:t xml:space="preserve">A Nation Always Online</w:t>
       </w:r>
     </w:p>
     <w:p>
@@ -1862,7 +1862,7 @@
           <w:sz w:val="44"/>
           <w:szCs w:val="44"/>
         </w:rPr>
-        <w:t xml:space="preserve">How Social Media Platforms Are Designed to Maximise Engagement</w:t>
+        <w:t xml:space="preserve">Engineered to Hold Attention</w:t>
       </w:r>
     </w:p>
     <w:p>
@@ -2347,7 +2347,7 @@
                 <w:sz w:val="26"/>
                 <w:szCs w:val="26"/>
               </w:rPr>
-              <w:t xml:space="preserve">   What is the dopamine loop?</w:t>
+              <w:t xml:space="preserve">   Inside the habit machine</w:t>
             </w:r>
           </w:p>
           <w:p>
@@ -3094,7 +3094,7 @@
           <w:sz w:val="44"/>
           <w:szCs w:val="44"/>
         </w:rPr>
-        <w:t xml:space="preserve">What Is Digital Detox and Why Does It Matter?</w:t>
+        <w:t xml:space="preserve">The Case for Switching Off</w:t>
       </w:r>
     </w:p>
     <w:p>
@@ -3793,7 +3793,7 @@
           <w:sz w:val="44"/>
           <w:szCs w:val="44"/>
         </w:rPr>
-        <w:t xml:space="preserve">Advancing Digital Detox: From Social Awareness to Public Policy</w:t>
+        <w:t xml:space="preserve">From Personal Choice to Public Rules</w:t>
       </w:r>
     </w:p>
     <w:p>
@@ -4700,7 +4700,7 @@
                 <w:sz w:val="26"/>
                 <w:szCs w:val="26"/>
               </w:rPr>
-              <w:t xml:space="preserve">   Young people and social media</w:t>
+              <w:t xml:space="preserve">   Children first: the global push for age limits</w:t>
             </w:r>
           </w:p>
           <w:p>
@@ -5865,7 +5865,7 @@
           <w:sz w:val="44"/>
           <w:szCs w:val="44"/>
         </w:rPr>
-        <w:t xml:space="preserve">The Implications of Digital Detox for Digital Banking in Vietnam</w:t>
+        <w:t xml:space="preserve">Banking in a Detox Era</w:t>
       </w:r>
     </w:p>
     <w:p>
@@ -8510,7 +8510,7 @@
           <w:sz w:val="44"/>
           <w:szCs w:val="44"/>
         </w:rPr>
-        <w:t xml:space="preserve">ABrighter Research View</w:t>
+        <w:t xml:space="preserve">The ABrighter Perspective</w:t>
       </w:r>
     </w:p>
     <w:p>
@@ -10167,7 +10167,7 @@
         <w:sz w:val="14"/>
         <w:szCs w:val="14"/>
       </w:rPr>
-      <w:t xml:space="preserve">Digital Detox: Restoring Balance in Vietnam's Digital Age</w:t>
+      <w:t xml:space="preserve">The Calm Dividend: Digital Detox and the Future of Banking in Vietnam</w:t>
     </w:r>
     <w:r>
       <w:rPr>

</xml_diff>